<commit_message>
docs(architecture): redraw V1 as top-down drill-down flows
</commit_message>
<xml_diff>
--- a/docs/architecture/v1-review-20260905/智能电商客服平台_V1构建与数据流审查.docx
+++ b/docs/architecture/v1-review-20260905/智能电商客服平台_V1构建与数据流审查.docx
@@ -35,7 +35,7 @@
       <w:r>
         <w:drawing>
           <wp:inline xmlns:a="http://schemas.openxmlformats.org/drawingml/2006/main" xmlns:pic="http://schemas.openxmlformats.org/drawingml/2006/picture">
-            <wp:extent cx="6565392" cy="6464387"/>
+            <wp:extent cx="6565392" cy="6363381"/>
             <wp:docPr id="1" name="Picture 1" descr="客户、客服和管理员通过局域网入口及网关访问各域；会话进入确定性编排，分流到商务、KF知识或人工工单。"/>
             <wp:cNvGraphicFramePr>
               <a:graphicFrameLocks noChangeAspect="1"/>
@@ -44,7 +44,7 @@
               <a:graphicData uri="http://schemas.openxmlformats.org/drawingml/2006/picture">
                 <pic:pic>
                   <pic:nvPicPr>
-                    <pic:cNvPr id="0" name="01_总体架构与在线数据流.png"/>
+                    <pic:cNvPr id="0" name="01_总体架构与在线数据流_print.png"/>
                     <pic:cNvPicPr/>
                   </pic:nvPicPr>
                   <pic:blipFill>
@@ -56,7 +56,7 @@
                   <pic:spPr>
                     <a:xfrm>
                       <a:off x="0" y="0"/>
-                      <a:ext cx="6565392" cy="6464387"/>
+                      <a:ext cx="6565392" cy="6363381"/>
                     </a:xfrm>
                     <a:prstGeom prst="rect"/>
                   </pic:spPr>
@@ -73,7 +73,7 @@
           <w:rFonts w:ascii="Microsoft YaHei" w:hAnsi="Microsoft YaHei" w:eastAsia="Microsoft YaHei"/>
           <w:sz w:val="19"/>
         </w:rPr>
-        <w:t>部署建议：Vue 三端 + FastAPI 模块化业务后端；Knowledge 与 Worker 独立运行。PyCharm + Conda 用于开发，Docker Compose 用于局域网部署。只开放 Nginx 入口，内部存储不向浏览器开放。</w:t>
+        <w:t>图示从一个入口逐层展开，横向仅保留条件分支。网页提供完整纵向长图和图 4 管理操作；Word 保留精简主干。部署仍采用 Vue 三端、FastAPI 业务后端、独立 Knowledge 与 Worker，仅 Nginx 对局域网开放。</w:t>
       </w:r>
     </w:p>
     <w:p>
@@ -1013,7 +1013,7 @@
       <w:r>
         <w:drawing>
           <wp:inline xmlns:a="http://schemas.openxmlformats.org/drawingml/2006/main" xmlns:pic="http://schemas.openxmlformats.org/drawingml/2006/picture">
-            <wp:extent cx="6565392" cy="6110866"/>
+            <wp:extent cx="6565392" cy="6464387"/>
             <wp:docPr id="2" name="Picture 2" descr="KF Stage0至7顺序及直答、FAQ标准答案直出、无证据提示分支；查询通过Embedding与Milvus召回，按计划重排。"/>
             <wp:cNvGraphicFramePr>
               <a:graphicFrameLocks noChangeAspect="1"/>
@@ -1022,7 +1022,7 @@
               <a:graphicData uri="http://schemas.openxmlformats.org/drawingml/2006/picture">
                 <pic:pic>
                   <pic:nvPicPr>
-                    <pic:cNvPr id="0" name="02_KF核心检索链路.png"/>
+                    <pic:cNvPr id="0" name="02_KF核心检索链路_print.png"/>
                     <pic:cNvPicPr/>
                   </pic:nvPicPr>
                   <pic:blipFill>
@@ -1034,7 +1034,7 @@
                   <pic:spPr>
                     <a:xfrm>
                       <a:off x="0" y="0"/>
-                      <a:ext cx="6565392" cy="6110866"/>
+                      <a:ext cx="6565392" cy="6464387"/>
                     </a:xfrm>
                     <a:prstGeom prst="rect"/>
                   </pic:spPr>
@@ -1088,7 +1088,7 @@
       <w:r>
         <w:drawing>
           <wp:inline xmlns:a="http://schemas.openxmlformats.org/drawingml/2006/main" xmlns:pic="http://schemas.openxmlformats.org/drawingml/2006/picture">
-            <wp:extent cx="6565392" cy="6009860"/>
+            <wp:extent cx="6565392" cy="6464387"/>
             <wp:docPr id="3" name="Picture 3" descr="知识上传、存储、可靠投递、解析索引、评测审核、版本发布以及评价纠错回到责任域改进的完整闭环。"/>
             <wp:cNvGraphicFramePr>
               <a:graphicFrameLocks noChangeAspect="1"/>
@@ -1097,7 +1097,7 @@
               <a:graphicData uri="http://schemas.openxmlformats.org/drawingml/2006/picture">
                 <pic:pic>
                   <pic:nvPicPr>
-                    <pic:cNvPr id="0" name="03_知识入库与数据闭环.png"/>
+                    <pic:cNvPr id="0" name="03_知识入库与数据闭环_print.png"/>
                     <pic:cNvPicPr/>
                   </pic:nvPicPr>
                   <pic:blipFill>
@@ -1109,7 +1109,7 @@
                   <pic:spPr>
                     <a:xfrm>
                       <a:off x="0" y="0"/>
-                      <a:ext cx="6565392" cy="6009860"/>
+                      <a:ext cx="6565392" cy="6464387"/>
                     </a:xfrm>
                     <a:prstGeom prst="rect"/>
                   </pic:spPr>

</xml_diff>